<commit_message>
docs: add team members to final report
</commit_message>
<xml_diff>
--- a/outputs/final/cloud-native-gitops-report.docx
+++ b/outputs/final/cloud-native-gitops-report.docx
@@ -41,6 +41,221 @@
         <w:t>https://github.com/AdelHussein01/CloudProj</w:t>
       </w:r>
     </w:p>
+    <w:p>
+      <w:r>
+        <w:rPr>
+          <w:b/>
+        </w:rPr>
+        <w:t>Team Members</w:t>
+      </w:r>
+    </w:p>
+    <w:tbl>
+      <w:tblPr>
+        <w:tblStyle w:val="TableGrid"/>
+        <w:tblW w:type="auto" w:w="0"/>
+        <w:tblLayout w:type="autofit"/>
+        <w:tblLook w:firstColumn="1" w:firstRow="1" w:lastColumn="0" w:lastRow="0" w:noHBand="0" w:noVBand="1" w:val="04A0"/>
+      </w:tblPr>
+      <w:tblGrid>
+        <w:gridCol w:w="4680"/>
+        <w:gridCol w:w="4680"/>
+      </w:tblGrid>
+      <w:tr>
+        <w:tc>
+          <w:tcPr>
+            <w:tcW w:type="dxa" w:w="4680"/>
+            <w:shd w:fill="E8EEF5"/>
+          </w:tcPr>
+          <w:p>
+            <w:r/>
+            <w:r>
+              <w:rPr>
+                <w:b/>
+                <w:sz w:val="19"/>
+              </w:rPr>
+              <w:t>Student Name</w:t>
+            </w:r>
+          </w:p>
+        </w:tc>
+        <w:tc>
+          <w:tcPr>
+            <w:tcW w:type="dxa" w:w="4680"/>
+            <w:shd w:fill="E8EEF5"/>
+          </w:tcPr>
+          <w:p>
+            <w:r/>
+            <w:r>
+              <w:rPr>
+                <w:b/>
+                <w:sz w:val="19"/>
+              </w:rPr>
+              <w:t>Student ID</w:t>
+            </w:r>
+          </w:p>
+        </w:tc>
+      </w:tr>
+      <w:tr>
+        <w:tc>
+          <w:tcPr>
+            <w:tcW w:type="dxa" w:w="4680"/>
+          </w:tcPr>
+          <w:p>
+            <w:r/>
+            <w:r>
+              <w:rPr>
+                <w:b w:val="0"/>
+                <w:sz w:val="18"/>
+              </w:rPr>
+              <w:t>Ammar Darwish</w:t>
+            </w:r>
+          </w:p>
+        </w:tc>
+        <w:tc>
+          <w:tcPr>
+            <w:tcW w:type="dxa" w:w="4680"/>
+          </w:tcPr>
+          <w:p>
+            <w:r/>
+            <w:r>
+              <w:rPr>
+                <w:b w:val="0"/>
+                <w:sz w:val="18"/>
+              </w:rPr>
+              <w:t>73226</w:t>
+            </w:r>
+          </w:p>
+        </w:tc>
+      </w:tr>
+      <w:tr>
+        <w:tc>
+          <w:tcPr>
+            <w:tcW w:type="dxa" w:w="4680"/>
+          </w:tcPr>
+          <w:p>
+            <w:r/>
+            <w:r>
+              <w:rPr>
+                <w:b w:val="0"/>
+                <w:sz w:val="18"/>
+              </w:rPr>
+              <w:t>Djonacy Sigawuke Jr</w:t>
+            </w:r>
+          </w:p>
+        </w:tc>
+        <w:tc>
+          <w:tcPr>
+            <w:tcW w:type="dxa" w:w="4680"/>
+          </w:tcPr>
+          <w:p>
+            <w:r/>
+            <w:r>
+              <w:rPr>
+                <w:b w:val="0"/>
+                <w:sz w:val="18"/>
+              </w:rPr>
+              <w:t>74294</w:t>
+            </w:r>
+          </w:p>
+        </w:tc>
+      </w:tr>
+      <w:tr>
+        <w:tc>
+          <w:tcPr>
+            <w:tcW w:type="dxa" w:w="4680"/>
+          </w:tcPr>
+          <w:p>
+            <w:r/>
+            <w:r>
+              <w:rPr>
+                <w:b w:val="0"/>
+                <w:sz w:val="18"/>
+              </w:rPr>
+              <w:t>Adel Hussein</w:t>
+            </w:r>
+          </w:p>
+        </w:tc>
+        <w:tc>
+          <w:tcPr>
+            <w:tcW w:type="dxa" w:w="4680"/>
+          </w:tcPr>
+          <w:p>
+            <w:r/>
+            <w:r>
+              <w:rPr>
+                <w:b w:val="0"/>
+                <w:sz w:val="18"/>
+              </w:rPr>
+              <w:t>73405</w:t>
+            </w:r>
+          </w:p>
+        </w:tc>
+      </w:tr>
+      <w:tr>
+        <w:tc>
+          <w:tcPr>
+            <w:tcW w:type="dxa" w:w="4680"/>
+          </w:tcPr>
+          <w:p>
+            <w:r/>
+            <w:r>
+              <w:rPr>
+                <w:b w:val="0"/>
+                <w:sz w:val="18"/>
+              </w:rPr>
+              <w:t>Daniel Kandemiri</w:t>
+            </w:r>
+          </w:p>
+        </w:tc>
+        <w:tc>
+          <w:tcPr>
+            <w:tcW w:type="dxa" w:w="4680"/>
+          </w:tcPr>
+          <w:p>
+            <w:r/>
+            <w:r>
+              <w:rPr>
+                <w:b w:val="0"/>
+                <w:sz w:val="18"/>
+              </w:rPr>
+              <w:t>73506</w:t>
+            </w:r>
+          </w:p>
+        </w:tc>
+      </w:tr>
+      <w:tr>
+        <w:tc>
+          <w:tcPr>
+            <w:tcW w:type="dxa" w:w="4680"/>
+          </w:tcPr>
+          <w:p>
+            <w:r/>
+            <w:r>
+              <w:rPr>
+                <w:b w:val="0"/>
+                <w:sz w:val="18"/>
+              </w:rPr>
+              <w:t>Assil Sediri</w:t>
+            </w:r>
+          </w:p>
+        </w:tc>
+        <w:tc>
+          <w:tcPr>
+            <w:tcW w:type="dxa" w:w="4680"/>
+          </w:tcPr>
+          <w:p>
+            <w:r/>
+            <w:r>
+              <w:rPr>
+                <w:b w:val="0"/>
+                <w:sz w:val="18"/>
+              </w:rPr>
+              <w:t>73476</w:t>
+            </w:r>
+          </w:p>
+        </w:tc>
+      </w:tr>
+    </w:tbl>
+    <w:p/>
     <w:p>
       <w:pPr>
         <w:pStyle w:val="Heading1"/>

</xml_diff>